<commit_message>
Updated notes and project proposal
</commit_message>
<xml_diff>
--- a/proposal/Project Proposal.docx
+++ b/proposal/Project Proposal.docx
@@ -46,15 +46,7 @@
         <w:ind w:right="971"/>
       </w:pPr>
       <w:r>
-        <w:t xml:space="preserve">In this task, you will submit a </w:t>
-      </w:r>
-      <w:proofErr w:type="gramStart"/>
-      <w:r>
-        <w:t>3-5 minute</w:t>
-      </w:r>
-      <w:proofErr w:type="gramEnd"/>
-      <w:r>
-        <w:t xml:space="preserve"> video presentation explaining the basic concept of your project. Your video format </w:t>
+        <w:t xml:space="preserve">In this task, you will submit a 3-5 minute video presentation explaining the basic concept of your project. Your video format </w:t>
       </w:r>
       <w:r>
         <w:rPr>
@@ -150,15 +142,7 @@
         <w:ind w:right="971"/>
       </w:pPr>
       <w:r>
-        <w:t xml:space="preserve">We recommend using visual supporting elements for your presentation (e.g. PowerPoint or similar slides). The video does not need to include footage of your </w:t>
-      </w:r>
-      <w:proofErr w:type="gramStart"/>
-      <w:r>
-        <w:t>face, but</w:t>
-      </w:r>
-      <w:proofErr w:type="gramEnd"/>
-      <w:r>
-        <w:t xml:space="preserve"> must include an audio aspect with you speaking.</w:t>
+        <w:t>We recommend using visual supporting elements for your presentation (e.g. PowerPoint or similar slides). The video does not need to include footage of your face, but must include an audio aspect with you speaking.</w:t>
       </w:r>
     </w:p>
     <w:p>
@@ -608,7 +592,6 @@
       <w:r>
         <w:t xml:space="preserve">seven types of handmade AES systems such as </w:t>
       </w:r>
-      <w:proofErr w:type="spellStart"/>
       <w:r>
         <w:t>IntelliMetric</w:t>
       </w:r>
@@ -618,24 +601,14 @@
         </w:rPr>
         <w:t>TM</w:t>
       </w:r>
-      <w:proofErr w:type="spellEnd"/>
       <w:r>
         <w:t xml:space="preserve">, MY </w:t>
       </w:r>
-      <w:proofErr w:type="gramStart"/>
-      <w:r>
-        <w:t>Access!,</w:t>
-      </w:r>
-      <w:proofErr w:type="gramEnd"/>
-      <w:r>
-        <w:t xml:space="preserve">  and </w:t>
-      </w:r>
-      <w:r>
-        <w:t xml:space="preserve"> </w:t>
-      </w:r>
-      <w:proofErr w:type="spellStart"/>
-      <w:r>
-        <w:t>Criterion</w:t>
+      <w:r>
+        <w:t xml:space="preserve">Access!,  and </w:t>
+      </w:r>
+      <w:r>
+        <w:t xml:space="preserve"> Criterion</w:t>
       </w:r>
       <w:r>
         <w:rPr>
@@ -643,7 +616,6 @@
         </w:rPr>
         <w:t>SM</w:t>
       </w:r>
-      <w:proofErr w:type="spellEnd"/>
       <w:r>
         <w:t xml:space="preserve"> to name a few</w:t>
       </w:r>
@@ -805,16 +777,11 @@
       <w:r>
         <w:t xml:space="preserve">ons between words even when they are not in </w:t>
       </w:r>
-      <w:proofErr w:type="gramStart"/>
       <w:r>
         <w:t xml:space="preserve">close </w:t>
       </w:r>
       <w:r>
-        <w:t>proximity</w:t>
-      </w:r>
-      <w:proofErr w:type="gramEnd"/>
-      <w:r>
-        <w:t xml:space="preserve">. </w:t>
+        <w:t xml:space="preserve">proximity. </w:t>
       </w:r>
       <w:r>
         <w:t>[1]</w:t>
@@ -831,22 +798,55 @@
       <w:r>
         <w:t xml:space="preserve">more promising. </w:t>
       </w:r>
-      <w:r>
-        <w:t xml:space="preserve">The </w:t>
-      </w:r>
-      <w:proofErr w:type="gramStart"/>
-      <w:r>
-        <w:t>researchers</w:t>
-      </w:r>
-      <w:proofErr w:type="gramEnd"/>
-      <w:r>
-        <w:t xml:space="preserve"> proposed approach is influenced by </w:t>
-      </w:r>
-      <w:r>
-        <w:t xml:space="preserve">the research and intends to employ a hybrid approach to AES incorporating at least three pretrained models to </w:t>
-      </w:r>
-      <w:r>
-        <w:t>automatically score essays to determine the degree to which the system can demonst</w:t>
+    </w:p>
+    <w:p>
+      <w:pPr>
+        <w:ind w:right="971"/>
+      </w:pPr>
+      <w:r>
+        <w:t xml:space="preserve">From extensive research done over he years in AES. There is no </w:t>
+      </w:r>
+      <w:r>
+        <w:t xml:space="preserve">specific model as of this writing that </w:t>
+      </w:r>
+      <w:r>
+        <w:t xml:space="preserve">achieves a near perfect accuracy when scoring essays. </w:t>
+      </w:r>
+      <w:r>
+        <w:t xml:space="preserve">Studies such as X and Y show that </w:t>
+      </w:r>
+      <w:r>
+        <w:t xml:space="preserve">A and B models are limited in C way. Thus the </w:t>
+      </w:r>
+      <w:r>
+        <w:t xml:space="preserve"> researchers prop</w:t>
+      </w:r>
+      <w:r>
+        <w:t xml:space="preserve">oses a </w:t>
+      </w:r>
+      <w:r>
+        <w:t xml:space="preserve">hybrid approach </w:t>
+      </w:r>
+      <w:r>
+        <w:t xml:space="preserve">that will </w:t>
+      </w:r>
+      <w:r>
+        <w:t>incorporat</w:t>
+      </w:r>
+      <w:r>
+        <w:t>e</w:t>
+      </w:r>
+      <w:r>
+        <w:t xml:space="preserve"> at least three pretrained models to </w:t>
+      </w:r>
+      <w:r>
+        <w:t>automatically score essays to determine the degree to which th</w:t>
+      </w:r>
+      <w:r>
+        <w:t>at</w:t>
+      </w:r>
+      <w:r>
+        <w:t xml:space="preserve"> system can demonst</w:t>
       </w:r>
       <w:r>
         <w:t xml:space="preserve">rate its reliability and candidacy for assistive implementation alongside human markers. </w:t>

</xml_diff>

<commit_message>
Tweaked the wording of last paragraph of project proposal
</commit_message>
<xml_diff>
--- a/proposal/Project Proposal.docx
+++ b/proposal/Project Proposal.docx
@@ -46,7 +46,15 @@
         <w:ind w:right="971"/>
       </w:pPr>
       <w:r>
-        <w:t xml:space="preserve">In this task, you will submit a 3-5 minute video presentation explaining the basic concept of your project. Your video format </w:t>
+        <w:t xml:space="preserve">In this task, you will submit a </w:t>
+      </w:r>
+      <w:proofErr w:type="gramStart"/>
+      <w:r>
+        <w:t>3-5 minute</w:t>
+      </w:r>
+      <w:proofErr w:type="gramEnd"/>
+      <w:r>
+        <w:t xml:space="preserve"> video presentation explaining the basic concept of your project. Your video format </w:t>
       </w:r>
       <w:r>
         <w:rPr>
@@ -142,7 +150,15 @@
         <w:ind w:right="971"/>
       </w:pPr>
       <w:r>
-        <w:t>We recommend using visual supporting elements for your presentation (e.g. PowerPoint or similar slides). The video does not need to include footage of your face, but must include an audio aspect with you speaking.</w:t>
+        <w:t xml:space="preserve">We recommend using visual supporting elements for your presentation (e.g. PowerPoint or similar slides). The video does not need to include footage of your </w:t>
+      </w:r>
+      <w:proofErr w:type="gramStart"/>
+      <w:r>
+        <w:t>face, but</w:t>
+      </w:r>
+      <w:proofErr w:type="gramEnd"/>
+      <w:r>
+        <w:t xml:space="preserve"> must include an audio aspect with you speaking.</w:t>
       </w:r>
     </w:p>
     <w:p>
@@ -505,10 +521,22 @@
         <w:t>]</w:t>
       </w:r>
       <w:r>
-        <w:t xml:space="preserve"> AES is often considered as a regression problem due to its focus on evaluating </w:t>
-      </w:r>
-      <w:r>
-        <w:t>essays quality. [1]</w:t>
+        <w:t xml:space="preserve"> AES is often considered as a regression problem due to its focus on evaluating</w:t>
+      </w:r>
+      <w:r>
+        <w:t xml:space="preserve"> the quality of</w:t>
+      </w:r>
+      <w:r>
+        <w:t xml:space="preserve"> </w:t>
+      </w:r>
+      <w:r>
+        <w:t>essay</w:t>
+      </w:r>
+      <w:r>
+        <w:t>s</w:t>
+      </w:r>
+      <w:r>
+        <w:t>. [1]</w:t>
       </w:r>
       <w:r>
         <w:t xml:space="preserve"> </w:t>
@@ -592,6 +620,7 @@
       <w:r>
         <w:t xml:space="preserve">seven types of handmade AES systems such as </w:t>
       </w:r>
+      <w:proofErr w:type="spellStart"/>
       <w:r>
         <w:t>IntelliMetric</w:t>
       </w:r>
@@ -601,14 +630,24 @@
         </w:rPr>
         <w:t>TM</w:t>
       </w:r>
+      <w:proofErr w:type="spellEnd"/>
       <w:r>
         <w:t xml:space="preserve">, MY </w:t>
       </w:r>
-      <w:r>
-        <w:t xml:space="preserve">Access!,  and </w:t>
-      </w:r>
-      <w:r>
-        <w:t xml:space="preserve"> Criterion</w:t>
+      <w:proofErr w:type="gramStart"/>
+      <w:r>
+        <w:t>Access!,</w:t>
+      </w:r>
+      <w:proofErr w:type="gramEnd"/>
+      <w:r>
+        <w:t xml:space="preserve">  and </w:t>
+      </w:r>
+      <w:r>
+        <w:t xml:space="preserve"> </w:t>
+      </w:r>
+      <w:proofErr w:type="spellStart"/>
+      <w:r>
+        <w:t>Criterion</w:t>
       </w:r>
       <w:r>
         <w:rPr>
@@ -616,11 +655,12 @@
         </w:rPr>
         <w:t>SM</w:t>
       </w:r>
+      <w:proofErr w:type="spellEnd"/>
       <w:r>
         <w:t xml:space="preserve"> to name a few</w:t>
       </w:r>
       <w:r>
-        <w:t xml:space="preserve">, with four that employed neutral networks. </w:t>
+        <w:t xml:space="preserve">, with four that employed neural networks. </w:t>
       </w:r>
       <w:r>
         <w:t xml:space="preserve"> </w:t>
@@ -663,13 +703,22 @@
         <w:t xml:space="preserve"> [5] concluded that although </w:t>
       </w:r>
       <w:r>
-        <w:t xml:space="preserve">the deep learning-based systems were more performant, </w:t>
-      </w:r>
-      <w:r>
-        <w:t xml:space="preserve">it was difficult to determine concretely an improvement with respect to </w:t>
-      </w:r>
-      <w:r>
-        <w:t xml:space="preserve">modelling complex linguistic and cognitive qualities inherent in essay. </w:t>
+        <w:t xml:space="preserve">the deep learning-based systems </w:t>
+      </w:r>
+      <w:r>
+        <w:t xml:space="preserve">performed better overall, </w:t>
+      </w:r>
+      <w:r>
+        <w:t xml:space="preserve">improvement with respect to </w:t>
+      </w:r>
+      <w:r>
+        <w:t>modelling complex linguistic and cognitive qualities inherent in essay</w:t>
+      </w:r>
+      <w:r>
+        <w:t>s was not significant</w:t>
+      </w:r>
+      <w:r>
+        <w:t xml:space="preserve">. </w:t>
       </w:r>
     </w:p>
     <w:p>
@@ -689,60 +738,48 @@
         <w:t xml:space="preserve">according to [2], </w:t>
       </w:r>
       <w:r>
-        <w:t xml:space="preserve">arose as an improvement to systems like PEG, </w:t>
-      </w:r>
-      <w:r>
-        <w:t xml:space="preserve">and </w:t>
-      </w:r>
-      <w:r>
-        <w:t xml:space="preserve">measures semantic alignment between student responses and </w:t>
-      </w:r>
-      <w:r>
-        <w:t>r</w:t>
-      </w:r>
-      <w:r>
-        <w:t xml:space="preserve">eference answers using vector-based representations, including Latent Semantic </w:t>
-      </w:r>
-      <w:r>
-        <w:t xml:space="preserve">Analysis (LSA), word embeddings, and transformer models such as BERT. </w:t>
-      </w:r>
-      <w:r>
-        <w:t xml:space="preserve">[2] concluded that a hybrid approach </w:t>
-      </w:r>
-      <w:r>
-        <w:t>–</w:t>
+        <w:t>arose as an improvement to systems like PEG</w:t>
+      </w:r>
+      <w:r>
+        <w:t xml:space="preserve">. </w:t>
+      </w:r>
+      <w:r>
+        <w:t xml:space="preserve">[2] </w:t>
+      </w:r>
+      <w:r>
+        <w:t xml:space="preserve">however, </w:t>
+      </w:r>
+      <w:r>
+        <w:t xml:space="preserve">concluded that a hybrid approach – Semantic Similarity Scoring, Rubric-Based Automated Scoring and Generative Scoring produced better results that corelated strongly with instructor assigned graded as compared to employing them individually.  </w:t>
       </w:r>
       <w:r>
         <w:t xml:space="preserve"> </w:t>
       </w:r>
-      <w:r>
-        <w:t xml:space="preserve">Semantic Similarity Scoring, Rubric-Based Automated Scoring and Generative Scoring </w:t>
-      </w:r>
-      <w:r>
-        <w:t xml:space="preserve">produced better results that corelated strongly with </w:t>
-      </w:r>
-      <w:r>
-        <w:t>instructor assigned graded</w:t>
-      </w:r>
-      <w:r>
-        <w:t xml:space="preserve"> as compared to employing them individually. </w:t>
+    </w:p>
+    <w:p>
+      <w:pPr>
+        <w:ind w:right="971"/>
+      </w:pPr>
+      <w:r>
+        <w:t>[4]</w:t>
       </w:r>
       <w:r>
         <w:t xml:space="preserve"> </w:t>
       </w:r>
-    </w:p>
-    <w:p>
-      <w:pPr>
-        <w:ind w:right="971"/>
-      </w:pPr>
-      <w:r>
-        <w:t>[4]</w:t>
+      <w:r>
+        <w:t>BERT</w:t>
+      </w:r>
+      <w:r>
+        <w:t>,</w:t>
       </w:r>
       <w:r>
         <w:t xml:space="preserve"> </w:t>
       </w:r>
       <w:r>
-        <w:t>BERT processes text</w:t>
+        <w:t xml:space="preserve">a transformer model, </w:t>
+      </w:r>
+      <w:r>
+        <w:t>processes text</w:t>
       </w:r>
       <w:r>
         <w:t xml:space="preserve"> bidirectionally, capturing the context of words by considering both preceding and succeeding words in a sentence. </w:t>
@@ -757,19 +794,22 @@
         <w:t xml:space="preserve">carried out a comparative study on the performance of LSTM, Bi-LSTM and BERT and concluded that </w:t>
       </w:r>
       <w:r>
-        <w:t xml:space="preserve">BERT was most performant. </w:t>
-      </w:r>
-      <w:r>
-        <w:t xml:space="preserve">[6] in reference to </w:t>
-      </w:r>
-      <w:r>
-        <w:t>transformer-based</w:t>
-      </w:r>
-      <w:r>
-        <w:t xml:space="preserve"> models such as BERT </w:t>
-      </w:r>
-      <w:r>
-        <w:t>indicated that these models have better scoring accuracy due to their ability to analyse text mo</w:t>
+        <w:t xml:space="preserve">BERT </w:t>
+      </w:r>
+      <w:r>
+        <w:t>demonstrated superior performance</w:t>
+      </w:r>
+      <w:r>
+        <w:t xml:space="preserve">. </w:t>
+      </w:r>
+      <w:r>
+        <w:t xml:space="preserve">[6] </w:t>
+      </w:r>
+      <w:r>
+        <w:t>transformer-based models</w:t>
+      </w:r>
+      <w:r>
+        <w:t xml:space="preserve"> have better scoring accuracy due to their ability to analyse text mo</w:t>
       </w:r>
       <w:r>
         <w:t>re thoroughly interpreting connecti</w:t>
@@ -778,22 +818,43 @@
         <w:t xml:space="preserve">ons between words even when they are not in </w:t>
       </w:r>
       <w:r>
-        <w:t xml:space="preserve">close </w:t>
-      </w:r>
-      <w:r>
-        <w:t xml:space="preserve">proximity. </w:t>
+        <w:t>proximity</w:t>
+      </w:r>
+      <w:r>
+        <w:t xml:space="preserve">. </w:t>
       </w:r>
       <w:r>
         <w:t>[1]</w:t>
       </w:r>
       <w:r>
-        <w:t xml:space="preserve"> suggests not relying on transformer models solely but like [2]</w:t>
+        <w:t xml:space="preserve"> suggests not relying </w:t>
+      </w:r>
+      <w:r>
+        <w:t xml:space="preserve">solely on </w:t>
+      </w:r>
+      <w:r>
+        <w:t xml:space="preserve">transformer models </w:t>
+      </w:r>
+      <w:r>
+        <w:t>and like</w:t>
+      </w:r>
+      <w:r>
+        <w:t xml:space="preserve"> [2]</w:t>
+      </w:r>
+      <w:r>
+        <w:t>,</w:t>
       </w:r>
       <w:r>
         <w:t xml:space="preserve"> proposed a technique of </w:t>
       </w:r>
       <w:r>
-        <w:t xml:space="preserve">combining transformers with more traditional approaches. [2] indicated that when this approach is employed the results are </w:t>
+        <w:t>combining transformers with more traditional approaches</w:t>
+      </w:r>
+      <w:r>
+        <w:t xml:space="preserve"> like those that employ handcrafted features</w:t>
+      </w:r>
+      <w:r>
+        <w:t xml:space="preserve">. [2] indicated that when this approach is employed the results are </w:t>
       </w:r>
       <w:r>
         <w:t xml:space="preserve">more promising. </w:t>
@@ -804,52 +865,145 @@
         <w:ind w:right="971"/>
       </w:pPr>
       <w:r>
-        <w:t xml:space="preserve">From extensive research done over he years in AES. There is no </w:t>
-      </w:r>
-      <w:r>
-        <w:t xml:space="preserve">specific model as of this writing that </w:t>
-      </w:r>
-      <w:r>
-        <w:t xml:space="preserve">achieves a near perfect accuracy when scoring essays. </w:t>
+        <w:t>Even after</w:t>
+      </w:r>
+      <w:r>
+        <w:t xml:space="preserve"> </w:t>
+      </w:r>
+      <w:r>
+        <w:t xml:space="preserve">extensive research spanning </w:t>
+      </w:r>
+      <w:r>
+        <w:t xml:space="preserve">more than </w:t>
+      </w:r>
+      <w:r>
+        <w:t>two decades in</w:t>
+      </w:r>
+      <w:r>
+        <w:t xml:space="preserve"> AES</w:t>
+      </w:r>
+      <w:r>
+        <w:t xml:space="preserve">, </w:t>
+      </w:r>
+      <w:r>
+        <w:t>no single model has</w:t>
+      </w:r>
+      <w:r>
+        <w:t xml:space="preserve"> achieve</w:t>
+      </w:r>
+      <w:r>
+        <w:t>d</w:t>
+      </w:r>
+      <w:r>
+        <w:t xml:space="preserve"> near</w:t>
+      </w:r>
+      <w:r>
+        <w:t>-</w:t>
+      </w:r>
+      <w:r>
+        <w:t>perfect accuracy in scoring sufficient to replace human scorers</w:t>
+      </w:r>
+      <w:r>
+        <w:t xml:space="preserve">. </w:t>
+      </w:r>
+      <w:r>
+        <w:t xml:space="preserve">Consequently, AES remains </w:t>
+      </w:r>
+      <w:r>
+        <w:t xml:space="preserve">an open research problem. </w:t>
       </w:r>
       <w:r>
         <w:t xml:space="preserve">Studies such as X and Y show that </w:t>
       </w:r>
       <w:r>
-        <w:t xml:space="preserve">A and B models are limited in C way. Thus the </w:t>
-      </w:r>
-      <w:r>
-        <w:t xml:space="preserve"> researchers prop</w:t>
+        <w:t xml:space="preserve">A and B models are limited in C way. </w:t>
+      </w:r>
+      <w:r>
+        <w:t>Therefore, this</w:t>
+      </w:r>
+      <w:r>
+        <w:t xml:space="preserve"> research</w:t>
+      </w:r>
+      <w:r>
+        <w:t xml:space="preserve"> prop</w:t>
       </w:r>
       <w:r>
         <w:t xml:space="preserve">oses a </w:t>
       </w:r>
       <w:r>
-        <w:t xml:space="preserve">hybrid approach </w:t>
-      </w:r>
-      <w:r>
-        <w:t xml:space="preserve">that will </w:t>
-      </w:r>
-      <w:r>
-        <w:t>incorporat</w:t>
-      </w:r>
-      <w:r>
-        <w:t>e</w:t>
-      </w:r>
-      <w:r>
-        <w:t xml:space="preserve"> at least three pretrained models to </w:t>
-      </w:r>
-      <w:r>
-        <w:t>automatically score essays to determine the degree to which th</w:t>
-      </w:r>
-      <w:r>
-        <w:t>at</w:t>
-      </w:r>
-      <w:r>
-        <w:t xml:space="preserve"> system can demonst</w:t>
-      </w:r>
-      <w:r>
-        <w:t xml:space="preserve">rate its reliability and candidacy for assistive implementation alongside human markers. </w:t>
+        <w:t>hybrid approach</w:t>
+      </w:r>
+      <w:r>
+        <w:t>, supported by the conclusion reached by [1] and [2</w:t>
+      </w:r>
+      <w:r>
+        <w:t xml:space="preserve">], </w:t>
+      </w:r>
+      <w:r>
+        <w:t xml:space="preserve">that </w:t>
+      </w:r>
+      <w:r>
+        <w:t>leverage</w:t>
+      </w:r>
+      <w:r>
+        <w:t>s</w:t>
+      </w:r>
+      <w:r>
+        <w:t xml:space="preserve"> the capabilities </w:t>
+      </w:r>
+      <w:r>
+        <w:t>of three</w:t>
+      </w:r>
+      <w:r>
+        <w:t xml:space="preserve"> pretrained models to</w:t>
+      </w:r>
+      <w:r>
+        <w:t xml:space="preserve"> perform</w:t>
+      </w:r>
+      <w:r>
+        <w:t xml:space="preserve"> tokeniz</w:t>
+      </w:r>
+      <w:r>
+        <w:t>ation</w:t>
+      </w:r>
+      <w:r>
+        <w:t xml:space="preserve">, </w:t>
+      </w:r>
+      <w:r>
+        <w:t>feature extraction</w:t>
+      </w:r>
+      <w:r>
+        <w:t xml:space="preserve">, </w:t>
+      </w:r>
+      <w:r>
+        <w:t>contextual and semantic analysis</w:t>
+      </w:r>
+      <w:r>
+        <w:t xml:space="preserve"> and </w:t>
+      </w:r>
+      <w:r>
+        <w:t>holistic essay scoring</w:t>
+      </w:r>
+      <w:r>
+        <w:t xml:space="preserve">. </w:t>
+      </w:r>
+      <w:r>
+        <w:t xml:space="preserve">This architecture </w:t>
+      </w:r>
+      <w:r>
+        <w:t>aims to investigate</w:t>
+      </w:r>
+      <w:r>
+        <w:t xml:space="preserve"> whether a hybrid </w:t>
+      </w:r>
+      <w:r>
+        <w:t xml:space="preserve">multi-modal </w:t>
+      </w:r>
+      <w:r>
+        <w:t xml:space="preserve">approach </w:t>
+      </w:r>
+      <w:r>
+        <w:t xml:space="preserve">can improve the overall performance, consistence and reliability of AES systems. </w:t>
       </w:r>
     </w:p>
     <w:p>

</xml_diff>

<commit_message>
Removed X place holder with source data
</commit_message>
<xml_diff>
--- a/proposal/Project Proposal.docx
+++ b/proposal/Project Proposal.docx
@@ -46,15 +46,7 @@
         <w:ind w:right="971"/>
       </w:pPr>
       <w:r>
-        <w:t xml:space="preserve">In this task, you will submit a </w:t>
-      </w:r>
-      <w:proofErr w:type="gramStart"/>
-      <w:r>
-        <w:t>3-5 minute</w:t>
-      </w:r>
-      <w:proofErr w:type="gramEnd"/>
-      <w:r>
-        <w:t xml:space="preserve"> video presentation explaining the basic concept of your project. Your video format </w:t>
+        <w:t xml:space="preserve">In this task, you will submit a 3-5 minute video presentation explaining the basic concept of your project. Your video format </w:t>
       </w:r>
       <w:r>
         <w:rPr>
@@ -150,15 +142,7 @@
         <w:ind w:right="971"/>
       </w:pPr>
       <w:r>
-        <w:t xml:space="preserve">We recommend using visual supporting elements for your presentation (e.g. PowerPoint or similar slides). The video does not need to include footage of your </w:t>
-      </w:r>
-      <w:proofErr w:type="gramStart"/>
-      <w:r>
-        <w:t>face, but</w:t>
-      </w:r>
-      <w:proofErr w:type="gramEnd"/>
-      <w:r>
-        <w:t xml:space="preserve"> must include an audio aspect with you speaking.</w:t>
+        <w:t>We recommend using visual supporting elements for your presentation (e.g. PowerPoint or similar slides). The video does not need to include footage of your face, but must include an audio aspect with you speaking.</w:t>
       </w:r>
     </w:p>
     <w:p>
@@ -247,7 +231,13 @@
         <w:t xml:space="preserve">An Automated Essay </w:t>
       </w:r>
       <w:r>
-        <w:t xml:space="preserve">Scoring </w:t>
+        <w:t>Scoring</w:t>
+      </w:r>
+      <w:r>
+        <w:t xml:space="preserve"> Hybrid</w:t>
+      </w:r>
+      <w:r>
+        <w:t xml:space="preserve"> </w:t>
       </w:r>
       <w:r>
         <w:t>M</w:t>
@@ -298,7 +288,10 @@
         <w:t xml:space="preserve"> </w:t>
       </w:r>
       <w:r>
-        <w:t xml:space="preserve">reducing bias and inconsistency </w:t>
+        <w:t>improving</w:t>
+      </w:r>
+      <w:r>
+        <w:t xml:space="preserve"> bias and inconsistency </w:t>
       </w:r>
       <w:r>
         <w:t xml:space="preserve">in scoring. </w:t>
@@ -620,7 +613,6 @@
       <w:r>
         <w:t xml:space="preserve">seven types of handmade AES systems such as </w:t>
       </w:r>
-      <w:proofErr w:type="spellStart"/>
       <w:r>
         <w:t>IntelliMetric</w:t>
       </w:r>
@@ -630,24 +622,14 @@
         </w:rPr>
         <w:t>TM</w:t>
       </w:r>
-      <w:proofErr w:type="spellEnd"/>
       <w:r>
         <w:t xml:space="preserve">, MY </w:t>
       </w:r>
-      <w:proofErr w:type="gramStart"/>
-      <w:r>
-        <w:t>Access!,</w:t>
-      </w:r>
-      <w:proofErr w:type="gramEnd"/>
-      <w:r>
-        <w:t xml:space="preserve">  and </w:t>
-      </w:r>
-      <w:r>
-        <w:t xml:space="preserve"> </w:t>
-      </w:r>
-      <w:proofErr w:type="spellStart"/>
-      <w:r>
-        <w:t>Criterion</w:t>
+      <w:r>
+        <w:t xml:space="preserve">Access!,  and </w:t>
+      </w:r>
+      <w:r>
+        <w:t xml:space="preserve"> Criterion</w:t>
       </w:r>
       <w:r>
         <w:rPr>
@@ -655,7 +637,6 @@
         </w:rPr>
         <w:t>SM</w:t>
       </w:r>
-      <w:proofErr w:type="spellEnd"/>
       <w:r>
         <w:t xml:space="preserve"> to name a few</w:t>
       </w:r>
@@ -741,266 +722,278 @@
         <w:t>arose as an improvement to systems like PEG</w:t>
       </w:r>
       <w:r>
+        <w:t xml:space="preserve">. [2] however, concluded that a hybrid approach – Semantic Similarity Scoring, Rubric-Based Automated Scoring and Generative Scoring produced better results that corelated strongly with instructor assigned graded as compared to employing them individually.  </w:t>
+      </w:r>
+      <w:r>
+        <w:t xml:space="preserve"> </w:t>
+      </w:r>
+    </w:p>
+    <w:p>
+      <w:pPr>
+        <w:ind w:right="971"/>
+      </w:pPr>
+      <w:r>
+        <w:t>[4]</w:t>
+      </w:r>
+      <w:r>
+        <w:t xml:space="preserve"> </w:t>
+      </w:r>
+      <w:r>
+        <w:t>BERT</w:t>
+      </w:r>
+      <w:r>
+        <w:t>,</w:t>
+      </w:r>
+      <w:r>
+        <w:t xml:space="preserve"> </w:t>
+      </w:r>
+      <w:r>
+        <w:t xml:space="preserve">a transformer model, </w:t>
+      </w:r>
+      <w:r>
+        <w:t>processes text</w:t>
+      </w:r>
+      <w:r>
+        <w:t xml:space="preserve"> bidirectionally, capturing the context of words by considering both preceding and succeeding words in a sentence. </w:t>
+      </w:r>
+      <w:r>
+        <w:t xml:space="preserve"> </w:t>
+      </w:r>
+      <w:r>
+        <w:t xml:space="preserve">[4] </w:t>
+      </w:r>
+      <w:r>
+        <w:t xml:space="preserve">carried out a comparative study on the performance of LSTM, Bi-LSTM and BERT and concluded that </w:t>
+      </w:r>
+      <w:r>
+        <w:t xml:space="preserve">BERT </w:t>
+      </w:r>
+      <w:r>
+        <w:t>demonstrated superior performance</w:t>
+      </w:r>
+      <w:r>
         <w:t xml:space="preserve">. </w:t>
       </w:r>
       <w:r>
-        <w:t xml:space="preserve">[2] </w:t>
-      </w:r>
-      <w:r>
-        <w:t xml:space="preserve">however, </w:t>
-      </w:r>
-      <w:r>
-        <w:t xml:space="preserve">concluded that a hybrid approach – Semantic Similarity Scoring, Rubric-Based Automated Scoring and Generative Scoring produced better results that corelated strongly with instructor assigned graded as compared to employing them individually.  </w:t>
+        <w:t xml:space="preserve">[6] </w:t>
+      </w:r>
+      <w:r>
+        <w:t>transformer-based models</w:t>
+      </w:r>
+      <w:r>
+        <w:t xml:space="preserve"> have better scoring accuracy due to their ability to analyse text mo</w:t>
+      </w:r>
+      <w:r>
+        <w:t>re thoroughly interpreting connecti</w:t>
+      </w:r>
+      <w:r>
+        <w:t xml:space="preserve">ons between words even when they are not in </w:t>
+      </w:r>
+      <w:r>
+        <w:t>proximity</w:t>
+      </w:r>
+      <w:r>
+        <w:t xml:space="preserve">. </w:t>
+      </w:r>
+      <w:r>
+        <w:t>[1]</w:t>
+      </w:r>
+      <w:r>
+        <w:t xml:space="preserve"> suggests not relying </w:t>
+      </w:r>
+      <w:r>
+        <w:t xml:space="preserve">solely on </w:t>
+      </w:r>
+      <w:r>
+        <w:t xml:space="preserve">transformer models </w:t>
+      </w:r>
+      <w:r>
+        <w:t>and like</w:t>
+      </w:r>
+      <w:r>
+        <w:t xml:space="preserve"> [2]</w:t>
+      </w:r>
+      <w:r>
+        <w:t>,</w:t>
+      </w:r>
+      <w:r>
+        <w:t xml:space="preserve"> proposed a technique of </w:t>
+      </w:r>
+      <w:r>
+        <w:t>combining transformers with more traditional approaches</w:t>
+      </w:r>
+      <w:r>
+        <w:t xml:space="preserve"> like those that employ handcrafted features</w:t>
+      </w:r>
+      <w:r>
+        <w:t xml:space="preserve">. [2] indicated that when this approach is employed the results are </w:t>
+      </w:r>
+      <w:r>
+        <w:t xml:space="preserve">more promising. </w:t>
+      </w:r>
+    </w:p>
+    <w:p>
+      <w:pPr>
+        <w:ind w:right="971"/>
+      </w:pPr>
+      <w:r>
+        <w:t>Even after</w:t>
       </w:r>
       <w:r>
         <w:t xml:space="preserve"> </w:t>
       </w:r>
-    </w:p>
-    <w:p>
-      <w:pPr>
-        <w:ind w:right="971"/>
-      </w:pPr>
-      <w:r>
-        <w:t>[4]</w:t>
+      <w:r>
+        <w:t xml:space="preserve">extensive research spanning </w:t>
+      </w:r>
+      <w:r>
+        <w:t xml:space="preserve">more than </w:t>
+      </w:r>
+      <w:r>
+        <w:t>two decades in</w:t>
+      </w:r>
+      <w:r>
+        <w:t xml:space="preserve"> AES</w:t>
+      </w:r>
+      <w:r>
+        <w:t xml:space="preserve">, </w:t>
+      </w:r>
+      <w:r>
+        <w:t>no single model has</w:t>
+      </w:r>
+      <w:r>
+        <w:t xml:space="preserve"> achieve</w:t>
+      </w:r>
+      <w:r>
+        <w:t>d</w:t>
+      </w:r>
+      <w:r>
+        <w:t xml:space="preserve"> near</w:t>
+      </w:r>
+      <w:r>
+        <w:t>-</w:t>
+      </w:r>
+      <w:r>
+        <w:t>perfect accuracy in scoring sufficient to replace human scorers</w:t>
+      </w:r>
+      <w:r>
+        <w:t xml:space="preserve">. </w:t>
+      </w:r>
+      <w:r>
+        <w:t xml:space="preserve">Consequently, AES remains </w:t>
+      </w:r>
+      <w:r>
+        <w:t xml:space="preserve">an open research problem. </w:t>
+      </w:r>
+      <w:r>
+        <w:t xml:space="preserve">Studies such as </w:t>
+      </w:r>
+      <w:r>
+        <w:t xml:space="preserve">[1] have indicated that aspects of an essay that refer to its content quality, such as coherence and persuasiveness are still very difficult to be effectively estimated even by an AES system. </w:t>
+      </w:r>
+      <w:r>
+        <w:t>[</w:t>
+      </w:r>
+      <w:r>
+        <w:t>7</w:t>
+      </w:r>
+      <w:r>
+        <w:t xml:space="preserve">] used a hybrid model – LSTM and WordEmbeddings and achieved a QWK of 0.94. </w:t>
+      </w:r>
+      <w:r>
+        <w:t>Therefore, this</w:t>
+      </w:r>
+      <w:r>
+        <w:t xml:space="preserve"> research</w:t>
+      </w:r>
+      <w:r>
+        <w:t xml:space="preserve"> prop</w:t>
+      </w:r>
+      <w:r>
+        <w:t xml:space="preserve">oses a </w:t>
+      </w:r>
+      <w:r>
+        <w:t>hybrid approach</w:t>
+      </w:r>
+      <w:r>
+        <w:t>, supported by the conclusion reached by [1]</w:t>
+      </w:r>
+      <w:r>
+        <w:t>,</w:t>
+      </w:r>
+      <w:r>
+        <w:t xml:space="preserve"> [2</w:t>
+      </w:r>
+      <w:r>
+        <w:t>]</w:t>
+      </w:r>
+      <w:r>
+        <w:t xml:space="preserve"> and [5] after evaluating the performance of stand-alone models</w:t>
+      </w:r>
+      <w:r>
+        <w:t xml:space="preserve"> in comparison to them</w:t>
+      </w:r>
+      <w:r>
+        <w:t>. This proposed model will</w:t>
       </w:r>
       <w:r>
         <w:t xml:space="preserve"> </w:t>
       </w:r>
       <w:r>
-        <w:t>BERT</w:t>
-      </w:r>
-      <w:r>
-        <w:t>,</w:t>
+        <w:t xml:space="preserve">leverage the capabilities </w:t>
+      </w:r>
+      <w:r>
+        <w:t>of three</w:t>
+      </w:r>
+      <w:r>
+        <w:t xml:space="preserve"> pretrained models to</w:t>
+      </w:r>
+      <w:r>
+        <w:t xml:space="preserve"> perform</w:t>
+      </w:r>
+      <w:r>
+        <w:t xml:space="preserve"> tokeniz</w:t>
+      </w:r>
+      <w:r>
+        <w:t>ation</w:t>
+      </w:r>
+      <w:r>
+        <w:t xml:space="preserve">, </w:t>
+      </w:r>
+      <w:r>
+        <w:t>feature extraction</w:t>
+      </w:r>
+      <w:r>
+        <w:t xml:space="preserve">, </w:t>
+      </w:r>
+      <w:r>
+        <w:t>contextual and semantic analysis</w:t>
+      </w:r>
+      <w:r>
+        <w:t xml:space="preserve"> and </w:t>
+      </w:r>
+      <w:r>
+        <w:t>holistic essay scoring</w:t>
+      </w:r>
+      <w:r>
+        <w:t xml:space="preserve">. </w:t>
+      </w:r>
+      <w:r>
+        <w:t xml:space="preserve">This architecture </w:t>
+      </w:r>
+      <w:r>
+        <w:t>aims to investigate</w:t>
+      </w:r>
+      <w:r>
+        <w:t xml:space="preserve"> whether a hybrid </w:t>
+      </w:r>
+      <w:r>
+        <w:t xml:space="preserve">multi-modal </w:t>
+      </w:r>
+      <w:r>
+        <w:t>system</w:t>
       </w:r>
       <w:r>
         <w:t xml:space="preserve"> </w:t>
-      </w:r>
-      <w:r>
-        <w:t xml:space="preserve">a transformer model, </w:t>
-      </w:r>
-      <w:r>
-        <w:t>processes text</w:t>
-      </w:r>
-      <w:r>
-        <w:t xml:space="preserve"> bidirectionally, capturing the context of words by considering both preceding and succeeding words in a sentence. </w:t>
-      </w:r>
-      <w:r>
-        <w:t xml:space="preserve"> </w:t>
-      </w:r>
-      <w:r>
-        <w:t xml:space="preserve">[4] </w:t>
-      </w:r>
-      <w:r>
-        <w:t xml:space="preserve">carried out a comparative study on the performance of LSTM, Bi-LSTM and BERT and concluded that </w:t>
-      </w:r>
-      <w:r>
-        <w:t xml:space="preserve">BERT </w:t>
-      </w:r>
-      <w:r>
-        <w:t>demonstrated superior performance</w:t>
-      </w:r>
-      <w:r>
-        <w:t xml:space="preserve">. </w:t>
-      </w:r>
-      <w:r>
-        <w:t xml:space="preserve">[6] </w:t>
-      </w:r>
-      <w:r>
-        <w:t>transformer-based models</w:t>
-      </w:r>
-      <w:r>
-        <w:t xml:space="preserve"> have better scoring accuracy due to their ability to analyse text mo</w:t>
-      </w:r>
-      <w:r>
-        <w:t>re thoroughly interpreting connecti</w:t>
-      </w:r>
-      <w:r>
-        <w:t xml:space="preserve">ons between words even when they are not in </w:t>
-      </w:r>
-      <w:r>
-        <w:t>proximity</w:t>
-      </w:r>
-      <w:r>
-        <w:t xml:space="preserve">. </w:t>
-      </w:r>
-      <w:r>
-        <w:t>[1]</w:t>
-      </w:r>
-      <w:r>
-        <w:t xml:space="preserve"> suggests not relying </w:t>
-      </w:r>
-      <w:r>
-        <w:t xml:space="preserve">solely on </w:t>
-      </w:r>
-      <w:r>
-        <w:t xml:space="preserve">transformer models </w:t>
-      </w:r>
-      <w:r>
-        <w:t>and like</w:t>
-      </w:r>
-      <w:r>
-        <w:t xml:space="preserve"> [2]</w:t>
-      </w:r>
-      <w:r>
-        <w:t>,</w:t>
-      </w:r>
-      <w:r>
-        <w:t xml:space="preserve"> proposed a technique of </w:t>
-      </w:r>
-      <w:r>
-        <w:t>combining transformers with more traditional approaches</w:t>
-      </w:r>
-      <w:r>
-        <w:t xml:space="preserve"> like those that employ handcrafted features</w:t>
-      </w:r>
-      <w:r>
-        <w:t xml:space="preserve">. [2] indicated that when this approach is employed the results are </w:t>
-      </w:r>
-      <w:r>
-        <w:t xml:space="preserve">more promising. </w:t>
-      </w:r>
-    </w:p>
-    <w:p>
-      <w:pPr>
-        <w:ind w:right="971"/>
-      </w:pPr>
-      <w:r>
-        <w:t>Even after</w:t>
-      </w:r>
-      <w:r>
-        <w:t xml:space="preserve"> </w:t>
-      </w:r>
-      <w:r>
-        <w:t xml:space="preserve">extensive research spanning </w:t>
-      </w:r>
-      <w:r>
-        <w:t xml:space="preserve">more than </w:t>
-      </w:r>
-      <w:r>
-        <w:t>two decades in</w:t>
-      </w:r>
-      <w:r>
-        <w:t xml:space="preserve"> AES</w:t>
-      </w:r>
-      <w:r>
-        <w:t xml:space="preserve">, </w:t>
-      </w:r>
-      <w:r>
-        <w:t>no single model has</w:t>
-      </w:r>
-      <w:r>
-        <w:t xml:space="preserve"> achieve</w:t>
-      </w:r>
-      <w:r>
-        <w:t>d</w:t>
-      </w:r>
-      <w:r>
-        <w:t xml:space="preserve"> near</w:t>
-      </w:r>
-      <w:r>
-        <w:t>-</w:t>
-      </w:r>
-      <w:r>
-        <w:t>perfect accuracy in scoring sufficient to replace human scorers</w:t>
-      </w:r>
-      <w:r>
-        <w:t xml:space="preserve">. </w:t>
-      </w:r>
-      <w:r>
-        <w:t xml:space="preserve">Consequently, AES remains </w:t>
-      </w:r>
-      <w:r>
-        <w:t xml:space="preserve">an open research problem. </w:t>
-      </w:r>
-      <w:r>
-        <w:t xml:space="preserve">Studies such as X and Y show that </w:t>
-      </w:r>
-      <w:r>
-        <w:t xml:space="preserve">A and B models are limited in C way. </w:t>
-      </w:r>
-      <w:r>
-        <w:t>Therefore, this</w:t>
-      </w:r>
-      <w:r>
-        <w:t xml:space="preserve"> research</w:t>
-      </w:r>
-      <w:r>
-        <w:t xml:space="preserve"> prop</w:t>
-      </w:r>
-      <w:r>
-        <w:t xml:space="preserve">oses a </w:t>
-      </w:r>
-      <w:r>
-        <w:t>hybrid approach</w:t>
-      </w:r>
-      <w:r>
-        <w:t>, supported by the conclusion reached by [1] and [2</w:t>
-      </w:r>
-      <w:r>
-        <w:t xml:space="preserve">], </w:t>
-      </w:r>
-      <w:r>
-        <w:t xml:space="preserve">that </w:t>
-      </w:r>
-      <w:r>
-        <w:t>leverage</w:t>
-      </w:r>
-      <w:r>
-        <w:t>s</w:t>
-      </w:r>
-      <w:r>
-        <w:t xml:space="preserve"> the capabilities </w:t>
-      </w:r>
-      <w:r>
-        <w:t>of three</w:t>
-      </w:r>
-      <w:r>
-        <w:t xml:space="preserve"> pretrained models to</w:t>
-      </w:r>
-      <w:r>
-        <w:t xml:space="preserve"> perform</w:t>
-      </w:r>
-      <w:r>
-        <w:t xml:space="preserve"> tokeniz</w:t>
-      </w:r>
-      <w:r>
-        <w:t>ation</w:t>
-      </w:r>
-      <w:r>
-        <w:t xml:space="preserve">, </w:t>
-      </w:r>
-      <w:r>
-        <w:t>feature extraction</w:t>
-      </w:r>
-      <w:r>
-        <w:t xml:space="preserve">, </w:t>
-      </w:r>
-      <w:r>
-        <w:t>contextual and semantic analysis</w:t>
-      </w:r>
-      <w:r>
-        <w:t xml:space="preserve"> and </w:t>
-      </w:r>
-      <w:r>
-        <w:t>holistic essay scoring</w:t>
-      </w:r>
-      <w:r>
-        <w:t xml:space="preserve">. </w:t>
-      </w:r>
-      <w:r>
-        <w:t xml:space="preserve">This architecture </w:t>
-      </w:r>
-      <w:r>
-        <w:t>aims to investigate</w:t>
-      </w:r>
-      <w:r>
-        <w:t xml:space="preserve"> whether a hybrid </w:t>
-      </w:r>
-      <w:r>
-        <w:t xml:space="preserve">multi-modal </w:t>
-      </w:r>
-      <w:r>
-        <w:t xml:space="preserve">approach </w:t>
       </w:r>
       <w:r>
         <w:t xml:space="preserve">can improve the overall performance, consistence and reliability of AES systems. </w:t>

</xml_diff>

<commit_message>
Edited sources and completed and uploaded proposal video
</commit_message>
<xml_diff>
--- a/proposal/Project Proposal.docx
+++ b/proposal/Project Proposal.docx
@@ -46,7 +46,15 @@
         <w:ind w:right="971"/>
       </w:pPr>
       <w:r>
-        <w:t xml:space="preserve">In this task, you will submit a 3-5 minute video presentation explaining the basic concept of your project. Your video format </w:t>
+        <w:t xml:space="preserve">In this task, you will submit a </w:t>
+      </w:r>
+      <w:proofErr w:type="gramStart"/>
+      <w:r>
+        <w:t>3-5 minute</w:t>
+      </w:r>
+      <w:proofErr w:type="gramEnd"/>
+      <w:r>
+        <w:t xml:space="preserve"> video presentation explaining the basic concept of your project. Your video format </w:t>
       </w:r>
       <w:r>
         <w:rPr>
@@ -142,7 +150,15 @@
         <w:ind w:right="971"/>
       </w:pPr>
       <w:r>
-        <w:t>We recommend using visual supporting elements for your presentation (e.g. PowerPoint or similar slides). The video does not need to include footage of your face, but must include an audio aspect with you speaking.</w:t>
+        <w:t xml:space="preserve">We recommend using visual supporting elements for your presentation (e.g. PowerPoint or similar slides). The video does not need to include footage of your </w:t>
+      </w:r>
+      <w:proofErr w:type="gramStart"/>
+      <w:r>
+        <w:t>face, but</w:t>
+      </w:r>
+      <w:proofErr w:type="gramEnd"/>
+      <w:r>
+        <w:t xml:space="preserve"> must include an audio aspect with you speaking.</w:t>
       </w:r>
     </w:p>
     <w:p>
@@ -704,6 +720,7 @@
       <w:r>
         <w:t xml:space="preserve">seven types of handmade AES systems such as </w:t>
       </w:r>
+      <w:proofErr w:type="spellStart"/>
       <w:r>
         <w:t>IntelliMetric</w:t>
       </w:r>
@@ -713,6 +730,7 @@
         </w:rPr>
         <w:t>TM</w:t>
       </w:r>
+      <w:proofErr w:type="spellEnd"/>
       <w:r>
         <w:t xml:space="preserve">, MY </w:t>
       </w:r>
@@ -720,10 +738,18 @@
         <w:t>Access!</w:t>
       </w:r>
       <w:r>
-        <w:t xml:space="preserve">  and </w:t>
-      </w:r>
-      <w:r>
-        <w:t xml:space="preserve"> Criterion</w:t>
+        <w:t xml:space="preserve">  </w:t>
+      </w:r>
+      <w:proofErr w:type="gramStart"/>
+      <w:r>
+        <w:t xml:space="preserve">and </w:t>
+      </w:r>
+      <w:r>
+        <w:t xml:space="preserve"> </w:t>
+      </w:r>
+      <w:proofErr w:type="spellStart"/>
+      <w:r>
+        <w:t>Criterion</w:t>
       </w:r>
       <w:r>
         <w:rPr>
@@ -731,6 +757,8 @@
         </w:rPr>
         <w:t>SM</w:t>
       </w:r>
+      <w:proofErr w:type="spellEnd"/>
+      <w:proofErr w:type="gramEnd"/>
       <w:r>
         <w:t xml:space="preserve"> to name a few</w:t>
       </w:r>
@@ -957,25 +985,13 @@
         <w:t xml:space="preserve">5] </w:t>
       </w:r>
       <w:r>
-        <w:t xml:space="preserve">argued that human evaluation remains important since expert markers </w:t>
-      </w:r>
-      <w:r>
-        <w:t>can identify</w:t>
-      </w:r>
-      <w:r>
-        <w:t xml:space="preserve"> subtle linguistic and cognitive qualities that automated systems may overlook</w:t>
+        <w:t>argued that human evaluation remains important since expert markers can identify subtle linguistic and cognitive qualities that automated systems may overlook</w:t>
       </w:r>
       <w:r>
         <w:t>.</w:t>
       </w:r>
       <w:r>
-        <w:t xml:space="preserve">[2] indicated that when </w:t>
-      </w:r>
-      <w:r>
-        <w:t>models work in combination the results ar</w:t>
-      </w:r>
-      <w:r>
-        <w:t xml:space="preserve">e more promising. </w:t>
+        <w:t xml:space="preserve">[2] indicated that when models work in combination the results are more promising. </w:t>
       </w:r>
       <w:r>
         <w:t>[</w:t>
@@ -1203,7 +1219,765 @@
         <w:t xml:space="preserve"> </w:t>
       </w:r>
     </w:p>
-    <w:p/>
+    <w:p>
+      <w:pPr>
+        <w:spacing w:after="160" w:line="278" w:lineRule="auto"/>
+        <w:ind w:left="0" w:right="0" w:firstLine="0"/>
+      </w:pPr>
+      <w:r>
+        <w:br w:type="page"/>
+      </w:r>
+    </w:p>
+    <w:p>
+      <w:r>
+        <w:lastRenderedPageBreak/>
+        <w:t>Reference List</w:t>
+      </w:r>
+    </w:p>
+    <w:p>
+      <w:pPr>
+        <w:ind w:right="-46"/>
+      </w:pPr>
+      <w:r>
+        <w:t xml:space="preserve">[1] P. Lagakis and S. </w:t>
+      </w:r>
+      <w:proofErr w:type="spellStart"/>
+      <w:r>
+        <w:t>Demetriadis</w:t>
+      </w:r>
+      <w:proofErr w:type="spellEnd"/>
+      <w:r>
+        <w:t>, “Automated essay scoring: A review</w:t>
+      </w:r>
+      <w:r>
+        <w:t xml:space="preserve"> </w:t>
+      </w:r>
+      <w:r>
+        <w:t xml:space="preserve">of the field,” in </w:t>
+      </w:r>
+      <w:r>
+        <w:rPr>
+          <w:i/>
+          <w:iCs/>
+        </w:rPr>
+        <w:t>2021 International Conference on Computer, Information and Telecommunication Systems (CITS)</w:t>
+      </w:r>
+      <w:r>
+        <w:t xml:space="preserve">, 2021, </w:t>
+      </w:r>
+      <w:proofErr w:type="spellStart"/>
+      <w:r>
+        <w:t>doi</w:t>
+      </w:r>
+      <w:proofErr w:type="spellEnd"/>
+      <w:r>
+        <w:t>: 10.1109/CITS52676.2021.9618476.</w:t>
+      </w:r>
+    </w:p>
+    <w:p>
+      <w:pPr>
+        <w:ind w:right="-46"/>
+      </w:pPr>
+      <w:r>
+        <w:t xml:space="preserve">[2] </w:t>
+      </w:r>
+      <w:r>
+        <w:t xml:space="preserve">I. M. G. S. Artha, A. S. Kusuma, and P. </w:t>
+      </w:r>
+      <w:proofErr w:type="spellStart"/>
+      <w:r>
+        <w:t>Sugiartawan</w:t>
+      </w:r>
+      <w:proofErr w:type="spellEnd"/>
+      <w:r>
+        <w:t xml:space="preserve">, “A comparative study of semantic similarity, rubric-based, generative AI, and hybrid scoring methods for automated essay evaluation,” in </w:t>
+      </w:r>
+      <w:r>
+        <w:rPr>
+          <w:i/>
+          <w:iCs/>
+        </w:rPr>
+        <w:t>2026 International Seminar on Intelligent Business and Edge-Computing Research (ISIBER)</w:t>
+      </w:r>
+      <w:r>
+        <w:t xml:space="preserve">, 2026, </w:t>
+      </w:r>
+      <w:proofErr w:type="spellStart"/>
+      <w:r>
+        <w:t>doi</w:t>
+      </w:r>
+      <w:proofErr w:type="spellEnd"/>
+      <w:r>
+        <w:t>: 10.1109/ISIBER68248.2026.11470541.</w:t>
+      </w:r>
+    </w:p>
+    <w:p>
+      <w:pPr>
+        <w:ind w:right="-46"/>
+      </w:pPr>
+      <w:r>
+        <w:t xml:space="preserve">[3] </w:t>
+      </w:r>
+      <w:r>
+        <w:t xml:space="preserve">J. Yang, “Automated essay scoring in education,” in </w:t>
+      </w:r>
+      <w:r>
+        <w:rPr>
+          <w:i/>
+          <w:iCs/>
+        </w:rPr>
+        <w:t>2024 4th International Conference on Educational Technology (ICET)</w:t>
+      </w:r>
+      <w:r>
+        <w:t xml:space="preserve">, 2024, </w:t>
+      </w:r>
+      <w:proofErr w:type="spellStart"/>
+      <w:r>
+        <w:t>doi</w:t>
+      </w:r>
+      <w:proofErr w:type="spellEnd"/>
+      <w:r>
+        <w:t>: 10.1109/ICET62460.2024.10868446.</w:t>
+      </w:r>
+    </w:p>
+    <w:p>
+      <w:pPr>
+        <w:ind w:right="-46"/>
+      </w:pPr>
+      <w:r>
+        <w:t xml:space="preserve">[4] </w:t>
+      </w:r>
+      <w:r>
+        <w:t xml:space="preserve">K. S. S. Han and M. T. Myint, “A comparative study of LSTM, Bi-LSTM, and BERT for automated essay scoring,” in </w:t>
+      </w:r>
+      <w:r>
+        <w:rPr>
+          <w:i/>
+          <w:iCs/>
+        </w:rPr>
+        <w:t>2024 5th International Conference on Advanced Information Technologies (ICAIT)</w:t>
+      </w:r>
+      <w:r>
+        <w:t xml:space="preserve">, 2024, </w:t>
+      </w:r>
+      <w:proofErr w:type="spellStart"/>
+      <w:r>
+        <w:t>doi</w:t>
+      </w:r>
+      <w:proofErr w:type="spellEnd"/>
+      <w:r>
+        <w:t>: 10.1109/ICAIT65209.2024.10754925.</w:t>
+      </w:r>
+    </w:p>
+    <w:p>
+      <w:pPr>
+        <w:ind w:right="-46"/>
+      </w:pPr>
+      <w:r>
+        <w:t xml:space="preserve">[5] </w:t>
+      </w:r>
+      <w:r>
+        <w:t xml:space="preserve">W. Xu, R. Mahmud, and W. L. Hoo, “A systematic literature review: Are automated essay scoring systems competent in real-life education scenarios?” </w:t>
+      </w:r>
+      <w:r>
+        <w:rPr>
+          <w:i/>
+          <w:iCs/>
+        </w:rPr>
+        <w:t>IEEE Access</w:t>
+      </w:r>
+      <w:r>
+        <w:t xml:space="preserve">, vol. 12, pp. 66959–66984, 2024, </w:t>
+      </w:r>
+      <w:proofErr w:type="spellStart"/>
+      <w:r>
+        <w:t>doi</w:t>
+      </w:r>
+      <w:proofErr w:type="spellEnd"/>
+      <w:r>
+        <w:t>: 10.1109/ACCESS.2024.3399163.</w:t>
+      </w:r>
+    </w:p>
+    <w:p>
+      <w:pPr>
+        <w:ind w:right="-46"/>
+      </w:pPr>
+      <w:r>
+        <w:t xml:space="preserve">[6] </w:t>
+      </w:r>
+      <w:r>
+        <w:t xml:space="preserve">A. M. </w:t>
+      </w:r>
+      <w:proofErr w:type="spellStart"/>
+      <w:r>
+        <w:t>Elmassry</w:t>
+      </w:r>
+      <w:proofErr w:type="spellEnd"/>
+      <w:r>
+        <w:t xml:space="preserve">, N. Zaki, N. Alsheikh, and M. </w:t>
+      </w:r>
+      <w:proofErr w:type="spellStart"/>
+      <w:r>
+        <w:t>Mediani</w:t>
+      </w:r>
+      <w:proofErr w:type="spellEnd"/>
+      <w:r>
+        <w:t xml:space="preserve">, “A systematic review of pretrained models in automated essay scoring,” </w:t>
+      </w:r>
+      <w:r>
+        <w:rPr>
+          <w:i/>
+          <w:iCs/>
+        </w:rPr>
+        <w:t>IEEE Access</w:t>
+      </w:r>
+      <w:r>
+        <w:t xml:space="preserve">, vol. 13, pp. 113245–113268, 2025, </w:t>
+      </w:r>
+      <w:proofErr w:type="spellStart"/>
+      <w:r>
+        <w:t>doi</w:t>
+      </w:r>
+      <w:proofErr w:type="spellEnd"/>
+      <w:r>
+        <w:t>: 10.1109/ACCESS.2025.3584784.</w:t>
+      </w:r>
+    </w:p>
+    <w:p>
+      <w:pPr>
+        <w:ind w:right="-46"/>
+      </w:pPr>
+      <w:r>
+        <w:t xml:space="preserve">[7] </w:t>
+      </w:r>
+      <w:r>
+        <w:t xml:space="preserve">Huang Chimingyang, “An Automatic System for Essay Questions Scoring Based on LSTM and Word Embedding,” in </w:t>
+      </w:r>
+      <w:r>
+        <w:rPr>
+          <w:i/>
+          <w:iCs/>
+        </w:rPr>
+        <w:t>Proceedings of the 2020 5th International Conference on Information Science, Computer Technology and Transportation (ISCTT)</w:t>
+      </w:r>
+      <w:r>
+        <w:t xml:space="preserve">, 2020, </w:t>
+      </w:r>
+      <w:proofErr w:type="spellStart"/>
+      <w:r>
+        <w:t>doi</w:t>
+      </w:r>
+      <w:proofErr w:type="spellEnd"/>
+      <w:r>
+        <w:t>: 10.1109/ISCTT51595.2020.00068.</w:t>
+      </w:r>
+    </w:p>
+    <w:p>
+      <w:pPr>
+        <w:ind w:right="-46"/>
+      </w:pPr>
+      <w:r>
+        <w:t xml:space="preserve">[8] </w:t>
+      </w:r>
+      <w:r>
+        <w:t xml:space="preserve">V. Suresh, A. Amrith Gold, R. </w:t>
+      </w:r>
+      <w:proofErr w:type="spellStart"/>
+      <w:r>
+        <w:t>Agasthiya</w:t>
+      </w:r>
+      <w:proofErr w:type="spellEnd"/>
+      <w:r>
+        <w:t xml:space="preserve">, and D. Chandru, “AI based Automated Essay Grading System using NLP,” in </w:t>
+      </w:r>
+      <w:r>
+        <w:rPr>
+          <w:i/>
+          <w:iCs/>
+        </w:rPr>
+        <w:t>Proceedings of the 2023 7th International Conference on Intelligent Computing and Control Systems (ICICCS)</w:t>
+      </w:r>
+      <w:r>
+        <w:t xml:space="preserve">, 2023, </w:t>
+      </w:r>
+      <w:proofErr w:type="spellStart"/>
+      <w:r>
+        <w:t>doi</w:t>
+      </w:r>
+      <w:proofErr w:type="spellEnd"/>
+      <w:r>
+        <w:t>: 10.1109/ICICCS56967.2023.10142822.</w:t>
+      </w:r>
+    </w:p>
+    <w:p>
+      <w:pPr>
+        <w:ind w:right="-46"/>
+      </w:pPr>
+      <w:r>
+        <w:t xml:space="preserve">[9] </w:t>
+      </w:r>
+      <w:r>
+        <w:t xml:space="preserve">R. Dadi and S. K. </w:t>
+      </w:r>
+      <w:proofErr w:type="spellStart"/>
+      <w:r>
+        <w:t>Sanampudi</w:t>
+      </w:r>
+      <w:proofErr w:type="spellEnd"/>
+      <w:r>
+        <w:t xml:space="preserve">, “A Robust Model for Automated Essay Scoring System,” in </w:t>
+      </w:r>
+      <w:r>
+        <w:rPr>
+          <w:i/>
+          <w:iCs/>
+        </w:rPr>
+        <w:t>Proceedings of the 2025 International Conference on Intelligent Systems and Computational Networks (ICISCN)</w:t>
+      </w:r>
+      <w:r>
+        <w:t xml:space="preserve">, 2025, </w:t>
+      </w:r>
+      <w:proofErr w:type="spellStart"/>
+      <w:r>
+        <w:t>doi</w:t>
+      </w:r>
+      <w:proofErr w:type="spellEnd"/>
+      <w:r>
+        <w:t>: 10.1109/ICISCN64258.2025.10934551.</w:t>
+      </w:r>
+    </w:p>
+    <w:p>
+      <w:pPr>
+        <w:spacing w:after="160" w:line="278" w:lineRule="auto"/>
+        <w:ind w:left="0" w:right="0" w:firstLine="0"/>
+      </w:pPr>
+      <w:r>
+        <w:br w:type="page"/>
+      </w:r>
+    </w:p>
+    <w:p>
+      <w:pPr>
+        <w:ind w:right="-46"/>
+        <w:rPr>
+          <w:b/>
+          <w:bCs/>
+        </w:rPr>
+      </w:pPr>
+      <w:r>
+        <w:rPr>
+          <w:b/>
+          <w:bCs/>
+        </w:rPr>
+        <w:lastRenderedPageBreak/>
+        <w:t>REORDER LATER</w:t>
+      </w:r>
+    </w:p>
+    <w:p>
+      <w:pPr>
+        <w:ind w:right="-46"/>
+        <w:rPr>
+          <w:b/>
+          <w:bCs/>
+        </w:rPr>
+      </w:pPr>
+      <w:r>
+        <w:rPr>
+          <w:b/>
+          <w:bCs/>
+        </w:rPr>
+        <w:t>Foundations / Overview of AES</w:t>
+      </w:r>
+    </w:p>
+    <w:p>
+      <w:pPr>
+        <w:ind w:right="-46"/>
+      </w:pPr>
+      <w:r>
+        <w:t xml:space="preserve">[1] J. Yang, “Automated essay scoring in education,” in </w:t>
+      </w:r>
+      <w:r>
+        <w:rPr>
+          <w:i/>
+          <w:iCs/>
+        </w:rPr>
+        <w:t>2024 4th International Conference on Educational Technology (ICET)</w:t>
+      </w:r>
+      <w:r>
+        <w:t xml:space="preserve">, 2024, </w:t>
+      </w:r>
+      <w:proofErr w:type="spellStart"/>
+      <w:r>
+        <w:t>doi</w:t>
+      </w:r>
+      <w:proofErr w:type="spellEnd"/>
+      <w:r>
+        <w:t>: 10.1109/ICET62460.2024.10868446.</w:t>
+      </w:r>
+    </w:p>
+    <w:p>
+      <w:pPr>
+        <w:ind w:right="-46"/>
+      </w:pPr>
+      <w:r>
+        <w:t xml:space="preserve">[2] P. Lagakis and S. </w:t>
+      </w:r>
+      <w:proofErr w:type="spellStart"/>
+      <w:r>
+        <w:t>Demetriadis</w:t>
+      </w:r>
+      <w:proofErr w:type="spellEnd"/>
+      <w:r>
+        <w:t xml:space="preserve">, “Automated essay scoring: A review of the field,” in </w:t>
+      </w:r>
+      <w:r>
+        <w:rPr>
+          <w:i/>
+          <w:iCs/>
+        </w:rPr>
+        <w:t>2021 International Conference on Computer, Information and Telecommunication Systems (CITS)</w:t>
+      </w:r>
+      <w:r>
+        <w:t xml:space="preserve">, 2021, </w:t>
+      </w:r>
+      <w:proofErr w:type="spellStart"/>
+      <w:r>
+        <w:t>doi</w:t>
+      </w:r>
+      <w:proofErr w:type="spellEnd"/>
+      <w:r>
+        <w:t>: 10.1109/CITS52676.2021.9618476.</w:t>
+      </w:r>
+    </w:p>
+    <w:p>
+      <w:pPr>
+        <w:ind w:right="-46"/>
+      </w:pPr>
+      <w:r>
+        <w:pict w14:anchorId="19A24CA4">
+          <v:rect id="_x0000_i1088" style="width:0;height:1.5pt" o:hralign="center" o:hrstd="t" o:hr="t" fillcolor="#a0a0a0" stroked="f"/>
+        </w:pict>
+      </w:r>
+    </w:p>
+    <w:p>
+      <w:pPr>
+        <w:ind w:right="-46"/>
+        <w:rPr>
+          <w:b/>
+          <w:bCs/>
+        </w:rPr>
+      </w:pPr>
+      <w:r>
+        <w:rPr>
+          <w:b/>
+          <w:bCs/>
+        </w:rPr>
+        <w:t xml:space="preserve">Classical NLP / Deep Learning Models (LSTM, </w:t>
+      </w:r>
+      <w:proofErr w:type="spellStart"/>
+      <w:r>
+        <w:rPr>
+          <w:b/>
+          <w:bCs/>
+        </w:rPr>
+        <w:t>BiLSTM</w:t>
+      </w:r>
+      <w:proofErr w:type="spellEnd"/>
+      <w:r>
+        <w:rPr>
+          <w:b/>
+          <w:bCs/>
+        </w:rPr>
+        <w:t>, Embeddings)</w:t>
+      </w:r>
+    </w:p>
+    <w:p>
+      <w:pPr>
+        <w:ind w:right="-46"/>
+      </w:pPr>
+      <w:r>
+        <w:t xml:space="preserve">[3] Huang </w:t>
+      </w:r>
+      <w:proofErr w:type="spellStart"/>
+      <w:r>
+        <w:t>Chimingyang</w:t>
+      </w:r>
+      <w:proofErr w:type="spellEnd"/>
+      <w:r>
+        <w:t xml:space="preserve">, “An Automatic System for Essay Questions Scoring Based on LSTM and Word Embedding,” in </w:t>
+      </w:r>
+      <w:r>
+        <w:rPr>
+          <w:i/>
+          <w:iCs/>
+        </w:rPr>
+        <w:t>Proceedings of the 2020 5th International Conference on Information Science, Computer Technology and Transportation (ISCTT)</w:t>
+      </w:r>
+      <w:r>
+        <w:t xml:space="preserve">, 2020, </w:t>
+      </w:r>
+      <w:proofErr w:type="spellStart"/>
+      <w:r>
+        <w:t>doi</w:t>
+      </w:r>
+      <w:proofErr w:type="spellEnd"/>
+      <w:r>
+        <w:t>: 10.1109/ISCTT51595.2020.00068.</w:t>
+      </w:r>
+    </w:p>
+    <w:p>
+      <w:pPr>
+        <w:ind w:right="-46"/>
+      </w:pPr>
+      <w:r>
+        <w:t xml:space="preserve">[4] V. Suresh, A. Amrith Gold, R. </w:t>
+      </w:r>
+      <w:proofErr w:type="spellStart"/>
+      <w:r>
+        <w:t>Agasthiya</w:t>
+      </w:r>
+      <w:proofErr w:type="spellEnd"/>
+      <w:r>
+        <w:t xml:space="preserve">, and D. Chandru, “AI based Automated Essay Grading System using NLP,” in </w:t>
+      </w:r>
+      <w:r>
+        <w:rPr>
+          <w:i/>
+          <w:iCs/>
+        </w:rPr>
+        <w:t>Proceedings of the 2023 7th International Conference on Intelligent Computing and Control Systems (ICICCS)</w:t>
+      </w:r>
+      <w:r>
+        <w:t xml:space="preserve">, 2023, </w:t>
+      </w:r>
+      <w:proofErr w:type="spellStart"/>
+      <w:r>
+        <w:t>doi</w:t>
+      </w:r>
+      <w:proofErr w:type="spellEnd"/>
+      <w:r>
+        <w:t>: 10.1109/ICICCS56967.2023.10142822.</w:t>
+      </w:r>
+    </w:p>
+    <w:p>
+      <w:pPr>
+        <w:ind w:right="-46"/>
+      </w:pPr>
+      <w:r>
+        <w:t xml:space="preserve">[5] R. Dadi and S. K. </w:t>
+      </w:r>
+      <w:proofErr w:type="spellStart"/>
+      <w:r>
+        <w:t>Sanampudi</w:t>
+      </w:r>
+      <w:proofErr w:type="spellEnd"/>
+      <w:r>
+        <w:t xml:space="preserve">, “A Robust Model for Automated Essay Scoring System,” in </w:t>
+      </w:r>
+      <w:r>
+        <w:rPr>
+          <w:i/>
+          <w:iCs/>
+        </w:rPr>
+        <w:t>Proceedings of the 2025 International Conference on Intelligent Systems and Computational Networks (ICISCN)</w:t>
+      </w:r>
+      <w:r>
+        <w:t xml:space="preserve">, 2025, </w:t>
+      </w:r>
+      <w:proofErr w:type="spellStart"/>
+      <w:r>
+        <w:t>doi</w:t>
+      </w:r>
+      <w:proofErr w:type="spellEnd"/>
+      <w:r>
+        <w:t>: 10.1109/ICISCN64258.2025.10934551.</w:t>
+      </w:r>
+    </w:p>
+    <w:p>
+      <w:pPr>
+        <w:ind w:right="-46"/>
+      </w:pPr>
+      <w:r>
+        <w:pict w14:anchorId="0262E41B">
+          <v:rect id="_x0000_i1089" style="width:0;height:1.5pt" o:hralign="center" o:hrstd="t" o:hr="t" fillcolor="#a0a0a0" stroked="f"/>
+        </w:pict>
+      </w:r>
+    </w:p>
+    <w:p>
+      <w:pPr>
+        <w:ind w:right="-46"/>
+        <w:rPr>
+          <w:b/>
+          <w:bCs/>
+        </w:rPr>
+      </w:pPr>
+      <w:r>
+        <w:rPr>
+          <w:b/>
+          <w:bCs/>
+        </w:rPr>
+        <w:t>Modern / Transformer / Hybrid / Comparative Approaches</w:t>
+      </w:r>
+    </w:p>
+    <w:p>
+      <w:pPr>
+        <w:ind w:right="-46"/>
+      </w:pPr>
+      <w:r>
+        <w:t xml:space="preserve">[6] K. S. S. Han and M. T. Myint, “A comparative study of LSTM, Bi-LSTM, and BERT for automated essay scoring,” in </w:t>
+      </w:r>
+      <w:r>
+        <w:rPr>
+          <w:i/>
+          <w:iCs/>
+        </w:rPr>
+        <w:t>2024 5th International Conference on Advanced Information Technologies (ICAIT)</w:t>
+      </w:r>
+      <w:r>
+        <w:t xml:space="preserve">, 2024, </w:t>
+      </w:r>
+      <w:proofErr w:type="spellStart"/>
+      <w:r>
+        <w:t>doi</w:t>
+      </w:r>
+      <w:proofErr w:type="spellEnd"/>
+      <w:r>
+        <w:t>: 10.1109/ICAIT65209.2024.10754925.</w:t>
+      </w:r>
+    </w:p>
+    <w:p>
+      <w:pPr>
+        <w:ind w:right="-46"/>
+      </w:pPr>
+      <w:r>
+        <w:t xml:space="preserve">[7] I. M. G. S. Artha, A. S. Kusuma, and P. </w:t>
+      </w:r>
+      <w:proofErr w:type="spellStart"/>
+      <w:r>
+        <w:t>Sugiartawan</w:t>
+      </w:r>
+      <w:proofErr w:type="spellEnd"/>
+      <w:r>
+        <w:t xml:space="preserve">, “A comparative study of semantic similarity, rubric-based, generative AI, and hybrid scoring methods for automated essay evaluation,” in </w:t>
+      </w:r>
+      <w:r>
+        <w:rPr>
+          <w:i/>
+          <w:iCs/>
+        </w:rPr>
+        <w:t>2026 International Seminar on Intelligent Business and Edge-Computing Research (ISIBER)</w:t>
+      </w:r>
+      <w:r>
+        <w:t xml:space="preserve">, 2026, </w:t>
+      </w:r>
+      <w:proofErr w:type="spellStart"/>
+      <w:r>
+        <w:t>doi</w:t>
+      </w:r>
+      <w:proofErr w:type="spellEnd"/>
+      <w:r>
+        <w:t>: 10.1109/ISIBER68248.2026.11470541.</w:t>
+      </w:r>
+    </w:p>
+    <w:p>
+      <w:pPr>
+        <w:ind w:right="-46"/>
+      </w:pPr>
+      <w:r>
+        <w:pict w14:anchorId="26D59FF3">
+          <v:rect id="_x0000_i1090" style="width:0;height:1.5pt" o:hralign="center" o:hrstd="t" o:hr="t" fillcolor="#a0a0a0" stroked="f"/>
+        </w:pict>
+      </w:r>
+    </w:p>
+    <w:p>
+      <w:pPr>
+        <w:ind w:right="-46"/>
+        <w:rPr>
+          <w:b/>
+          <w:bCs/>
+        </w:rPr>
+      </w:pPr>
+      <w:r>
+        <w:rPr>
+          <w:b/>
+          <w:bCs/>
+        </w:rPr>
+        <w:lastRenderedPageBreak/>
+        <w:t>Systematic Reviews / High-Level Analysis</w:t>
+      </w:r>
+    </w:p>
+    <w:p>
+      <w:pPr>
+        <w:ind w:right="-46"/>
+      </w:pPr>
+      <w:r>
+        <w:t xml:space="preserve">[8] W. Xu, R. Mahmud, and W. L. Hoo, “A systematic literature review: Are automated essay scoring systems competent in real-life education scenarios?” </w:t>
+      </w:r>
+      <w:r>
+        <w:rPr>
+          <w:i/>
+          <w:iCs/>
+        </w:rPr>
+        <w:t>IEEE Access</w:t>
+      </w:r>
+      <w:r>
+        <w:t xml:space="preserve">, vol. 12, pp. 66959–66984, 2024, </w:t>
+      </w:r>
+      <w:proofErr w:type="spellStart"/>
+      <w:r>
+        <w:t>doi</w:t>
+      </w:r>
+      <w:proofErr w:type="spellEnd"/>
+      <w:r>
+        <w:t>: 10.1109/ACCESS.2024.3399163.</w:t>
+      </w:r>
+    </w:p>
+    <w:p>
+      <w:pPr>
+        <w:ind w:right="-46"/>
+      </w:pPr>
+      <w:r>
+        <w:t xml:space="preserve">[9] A. M. </w:t>
+      </w:r>
+      <w:proofErr w:type="spellStart"/>
+      <w:r>
+        <w:t>Elmassry</w:t>
+      </w:r>
+      <w:proofErr w:type="spellEnd"/>
+      <w:r>
+        <w:t xml:space="preserve">, N. Zaki, N. Alsheikh, and M. </w:t>
+      </w:r>
+      <w:proofErr w:type="spellStart"/>
+      <w:r>
+        <w:t>Mediani</w:t>
+      </w:r>
+      <w:proofErr w:type="spellEnd"/>
+      <w:r>
+        <w:t xml:space="preserve">, “A systematic review of pretrained models in automated essay scoring,” </w:t>
+      </w:r>
+      <w:r>
+        <w:rPr>
+          <w:i/>
+          <w:iCs/>
+        </w:rPr>
+        <w:t>IEEE Access</w:t>
+      </w:r>
+      <w:r>
+        <w:t xml:space="preserve">, vol. 13, pp. 113245–113268, 2025, </w:t>
+      </w:r>
+      <w:proofErr w:type="spellStart"/>
+      <w:r>
+        <w:t>doi</w:t>
+      </w:r>
+      <w:proofErr w:type="spellEnd"/>
+      <w:r>
+        <w:t>: 10.1109/ACCESS.2025.3584784.</w:t>
+      </w:r>
+    </w:p>
+    <w:p>
+      <w:pPr>
+        <w:ind w:right="-46"/>
+      </w:pPr>
+    </w:p>
     <w:sectPr>
       <w:pgSz w:w="11906" w:h="16838"/>
       <w:pgMar w:top="1440" w:right="1440" w:bottom="1440" w:left="1440" w:header="708" w:footer="708" w:gutter="0"/>
@@ -2770,6 +3544,17 @@
       <w:spacing w:val="5"/>
     </w:rPr>
   </w:style>
+  <w:style w:type="paragraph" w:styleId="NormalWeb">
+    <w:name w:val="Normal (Web)"/>
+    <w:basedOn w:val="Normal"/>
+    <w:uiPriority w:val="99"/>
+    <w:semiHidden/>
+    <w:unhideWhenUsed/>
+    <w:rsid w:val="003572F3"/>
+    <w:rPr>
+      <w:rFonts w:ascii="Times New Roman" w:hAnsi="Times New Roman" w:cs="Times New Roman"/>
+    </w:rPr>
+  </w:style>
 </w:styles>
 </file>
 

</xml_diff>